<commit_message>
Add repository link to report and README
</commit_message>
<xml_diff>
--- a/report/Low_Group_Delay_Morphology_Preserving_Filtering_Report.docx
+++ b/report/Low_Group_Delay_Morphology_Preserving_Filtering_Report.docx
@@ -78,6 +78,17 @@
           <w:sz w:val="21"/>
         </w:rPr>
         <w:t>Department of Engineering Design, IIT Madras</w:t>
+      </w:r>
+    </w:p>
+    <w:p>
+      <w:pPr>
+        <w:jc w:val="center"/>
+      </w:pPr>
+      <w:r>
+        <w:rPr>
+          <w:sz w:val="21"/>
+        </w:rPr>
+        <w:t>Code repository: https://github.com/shahidibrahimvn015/low-delay-morphology-filtering</w:t>
       </w:r>
     </w:p>
     <w:p>
@@ -16350,11 +16361,21 @@
         <w:rPr>
           <w:b/>
         </w:rPr>
+        <w:t>Code repository:</w:t>
+      </w:r>
+      <w:r>
+        <w:rPr/>
+        <w:t xml:space="preserve"> https://github.com/shahidibrahimvn015/low-delay-morphology-filtering. </w:t>
+      </w:r>
+      <w:r>
+        <w:rPr>
+          <w:b/>
+        </w:rPr>
         <w:t>Reproduction:</w:t>
       </w:r>
       <w:r>
         <w:rPr/>
-        <w:t xml:space="preserve"> pip install -r requirements.txt, then python run_all.py. The datasets are downloaded by scripts/00_download_data.py from PhysioNet's AWS open-data mirror and are not redistributed. All parameters and seeds are in config/params.json, and every number in this report is generated from results/ by scripts/09_build_report.py.</w:t>
+        <w:t xml:space="preserve"> clone the repository, then pip install -r requirements.txt and python run_all.py. The datasets are downloaded by scripts/00_download_data.py from PhysioNet's AWS open-data mirror and are not redistributed. All parameters and seeds are in config/params.json, and every number in this report is generated from results/ by scripts/09_build_report.py.</w:t>
       </w:r>
     </w:p>
     <w:sectPr>

</xml_diff>

<commit_message>
Add author contributions to the report
</commit_message>
<xml_diff>
--- a/report/Low_Group_Delay_Morphology_Preserving_Filtering_Report.docx
+++ b/report/Low_Group_Delay_Morphology_Preserving_Filtering_Report.docx
@@ -5614,7 +5614,7 @@
           <w:noProof/>
         </w:rPr>
         <w:drawing>
-          <wp:inline distT="0" distB="0" distL="0" distR="0" wp14:anchorId="3FB91BEA" wp14:editId="3B70AE75">
+          <wp:inline distT="0" distB="0" distL="0" distR="0" wp14:anchorId="5D3340F1" wp14:editId="124F4614">
             <wp:extent cx="5940000" cy="2064172"/>
             <wp:effectExtent l="0" t="0" r="0" b="0"/>
             <wp:docPr id="1" name="Picture 1"/>
@@ -5677,7 +5677,7 @@
           <w:noProof/>
         </w:rPr>
         <w:drawing>
-          <wp:inline distT="0" distB="0" distL="0" distR="0" wp14:anchorId="6CE19F29" wp14:editId="26A3CDE0">
+          <wp:inline distT="0" distB="0" distL="0" distR="0" wp14:anchorId="06402FA8" wp14:editId="6770F0F5">
             <wp:extent cx="5940000" cy="1772439"/>
             <wp:effectExtent l="0" t="0" r="0" b="0"/>
             <wp:docPr id="2" name="Picture 2"/>
@@ -5754,7 +5754,7 @@
         </w:rPr>
         <w:lastRenderedPageBreak/>
         <w:drawing>
-          <wp:inline distT="0" distB="0" distL="0" distR="0" wp14:anchorId="751DC617" wp14:editId="124557A5">
+          <wp:inline distT="0" distB="0" distL="0" distR="0" wp14:anchorId="72D8D84B" wp14:editId="03EEA7AA">
             <wp:extent cx="5940000" cy="2005447"/>
             <wp:effectExtent l="0" t="0" r="0" b="0"/>
             <wp:docPr id="3" name="Picture 3"/>
@@ -5817,7 +5817,7 @@
           <w:noProof/>
         </w:rPr>
         <w:drawing>
-          <wp:inline distT="0" distB="0" distL="0" distR="0" wp14:anchorId="09400F04" wp14:editId="798CB729">
+          <wp:inline distT="0" distB="0" distL="0" distR="0" wp14:anchorId="75A2E651" wp14:editId="056AAF29">
             <wp:extent cx="5040000" cy="3354172"/>
             <wp:effectExtent l="0" t="0" r="0" b="0"/>
             <wp:docPr id="4" name="Picture 4"/>
@@ -5881,7 +5881,7 @@
         </w:rPr>
         <w:lastRenderedPageBreak/>
         <w:drawing>
-          <wp:inline distT="0" distB="0" distL="0" distR="0" wp14:anchorId="265B8E44" wp14:editId="216D8F9C">
+          <wp:inline distT="0" distB="0" distL="0" distR="0" wp14:anchorId="68CE6393" wp14:editId="50CEFAA2">
             <wp:extent cx="5940000" cy="2064172"/>
             <wp:effectExtent l="0" t="0" r="0" b="0"/>
             <wp:docPr id="5" name="Picture 5"/>
@@ -6867,7 +6867,7 @@
           <w:noProof/>
         </w:rPr>
         <w:drawing>
-          <wp:inline distT="0" distB="0" distL="0" distR="0" wp14:anchorId="032B2366" wp14:editId="28F9BDB9">
+          <wp:inline distT="0" distB="0" distL="0" distR="0" wp14:anchorId="2F71F8D6" wp14:editId="4263F75E">
             <wp:extent cx="5940000" cy="1568089"/>
             <wp:effectExtent l="0" t="0" r="0" b="0"/>
             <wp:docPr id="6" name="Picture 6"/>
@@ -6943,7 +6943,7 @@
           <w:noProof/>
         </w:rPr>
         <w:drawing>
-          <wp:inline distT="0" distB="0" distL="0" distR="0" wp14:anchorId="0FF0287F" wp14:editId="0B4E42CB">
+          <wp:inline distT="0" distB="0" distL="0" distR="0" wp14:anchorId="1015B1E2" wp14:editId="2B55F1B0">
             <wp:extent cx="5940000" cy="1568089"/>
             <wp:effectExtent l="0" t="0" r="0" b="0"/>
             <wp:docPr id="7" name="Picture 7"/>
@@ -7007,7 +7007,7 @@
           <w:noProof/>
         </w:rPr>
         <w:drawing>
-          <wp:inline distT="0" distB="0" distL="0" distR="0" wp14:anchorId="54651121" wp14:editId="444EFF59">
+          <wp:inline distT="0" distB="0" distL="0" distR="0" wp14:anchorId="1B25A476" wp14:editId="0E230D33">
             <wp:extent cx="5940000" cy="2064172"/>
             <wp:effectExtent l="0" t="0" r="0" b="0"/>
             <wp:docPr id="8" name="Picture 8"/>
@@ -7070,7 +7070,7 @@
           <w:noProof/>
         </w:rPr>
         <w:drawing>
-          <wp:inline distT="0" distB="0" distL="0" distR="0" wp14:anchorId="25A6C370" wp14:editId="09A46BD1">
+          <wp:inline distT="0" distB="0" distL="0" distR="0" wp14:anchorId="71BE1832" wp14:editId="24B3189F">
             <wp:extent cx="3960000" cy="2549492"/>
             <wp:effectExtent l="0" t="0" r="0" b="0"/>
             <wp:docPr id="9" name="Picture 9"/>
@@ -9928,7 +9928,7 @@
         </w:rPr>
         <w:lastRenderedPageBreak/>
         <w:drawing>
-          <wp:inline distT="0" distB="0" distL="0" distR="0" wp14:anchorId="03C8F963" wp14:editId="5013F0E1">
+          <wp:inline distT="0" distB="0" distL="0" distR="0" wp14:anchorId="05C45951" wp14:editId="58A32BD3">
             <wp:extent cx="5940000" cy="2122897"/>
             <wp:effectExtent l="0" t="0" r="0" b="0"/>
             <wp:docPr id="10" name="Picture 10"/>
@@ -11772,7 +11772,7 @@
           <w:noProof/>
         </w:rPr>
         <w:drawing>
-          <wp:inline distT="0" distB="0" distL="0" distR="0" wp14:anchorId="280CBE22" wp14:editId="0BE6E264">
+          <wp:inline distT="0" distB="0" distL="0" distR="0" wp14:anchorId="06D52EB9" wp14:editId="3B6E265B">
             <wp:extent cx="5940000" cy="3292373"/>
             <wp:effectExtent l="0" t="0" r="0" b="0"/>
             <wp:docPr id="11" name="Picture 11"/>
@@ -11835,7 +11835,7 @@
           <w:noProof/>
         </w:rPr>
         <w:drawing>
-          <wp:inline distT="0" distB="0" distL="0" distR="0" wp14:anchorId="3387C71C" wp14:editId="7AEE3A29">
+          <wp:inline distT="0" distB="0" distL="0" distR="0" wp14:anchorId="0BC23EEA" wp14:editId="35F43FEB">
             <wp:extent cx="5940000" cy="3267935"/>
             <wp:effectExtent l="0" t="0" r="0" b="0"/>
             <wp:docPr id="12" name="Picture 12"/>
@@ -13682,7 +13682,7 @@
           <w:noProof/>
         </w:rPr>
         <w:drawing>
-          <wp:inline distT="0" distB="0" distL="0" distR="0" wp14:anchorId="203A318E" wp14:editId="738BD565">
+          <wp:inline distT="0" distB="0" distL="0" distR="0" wp14:anchorId="7644FAF3" wp14:editId="4F5C41A6">
             <wp:extent cx="5940000" cy="2005447"/>
             <wp:effectExtent l="0" t="0" r="0" b="0"/>
             <wp:docPr id="13" name="Picture 13"/>
@@ -15704,7 +15704,7 @@
         </w:rPr>
         <w:lastRenderedPageBreak/>
         <w:drawing>
-          <wp:inline distT="0" distB="0" distL="0" distR="0" wp14:anchorId="56868877" wp14:editId="022E11FA">
+          <wp:inline distT="0" distB="0" distL="0" distR="0" wp14:anchorId="214F636F" wp14:editId="7DA662E6">
             <wp:extent cx="5940000" cy="2005447"/>
             <wp:effectExtent l="0" t="0" r="0" b="0"/>
             <wp:docPr id="14" name="Picture 14"/>
@@ -17136,6 +17136,27 @@
       </w:r>
       <w:r>
         <w:t xml:space="preserve"> clone the repository, then pip install -r requirements.txt and python run_all.py. The datasets are downloaded by scripts/00_download_data.py from PhysioNet's AWS open-data mirror and are not redistributed. All parameters and seeds are in config/params.json, and every number in this report is taken from the output files in results/.</w:t>
+      </w:r>
+    </w:p>
+    <w:p>
+      <w:pPr>
+        <w:pStyle w:val="Heading1"/>
+      </w:pPr>
+      <w:r>
+        <w:t>Author contributions</w:t>
+      </w:r>
+    </w:p>
+    <w:p>
+      <w:pPr>
+        <w:spacing w:after="80"/>
+        <w:jc w:val="both"/>
+      </w:pPr>
+      <w:r>
+        <w:t xml:space="preserve">V.N.S.I. derived the morphology-error model and the group-delay kernel, formulated MO-LDFIR as a second-order-cone program, and carried out its ablations, the latency-budget sweep, the computational-cost analysis and the error-model validation. N.P. defined the signal model, matched specification and metrics, designed the baseline filters, produced the phase, group-delay, pole-zero and transient analyses, and carried out the finite word-length study. M.T. </w:t>
+      </w:r>
+      <w:r>
+        <w:lastRenderedPageBreak/>
+        <w:t>built the data and evaluation pipeline, including the DS1 hyperparameter selection, implemented the synthetic ECG Monte-Carlo experiments, ran the MIT-BIH DS2 and PTB-XL validation with the statistical analysis, and prepared the reproducibility package. D.M. developed EW-APE and the classical equalizer baseline, ran the Pareto sweeps and the PPG case study, and wrote the design recommendations and limitations. All authors contributed to the literature review and to writing and revising the report.</w:t>
       </w:r>
     </w:p>
     <w:sectPr>
@@ -17321,31 +17342,31 @@
       </w:rPr>
     </w:lvl>
   </w:abstractNum>
-  <w:num w:numId="1" w16cid:durableId="1528982090">
+  <w:num w:numId="1" w16cid:durableId="580650492">
     <w:abstractNumId w:val="8"/>
   </w:num>
-  <w:num w:numId="2" w16cid:durableId="71782722">
+  <w:num w:numId="2" w16cid:durableId="1475178387">
     <w:abstractNumId w:val="6"/>
   </w:num>
-  <w:num w:numId="3" w16cid:durableId="1333994561">
+  <w:num w:numId="3" w16cid:durableId="1956011201">
     <w:abstractNumId w:val="5"/>
   </w:num>
-  <w:num w:numId="4" w16cid:durableId="810560649">
+  <w:num w:numId="4" w16cid:durableId="2130203503">
     <w:abstractNumId w:val="4"/>
   </w:num>
-  <w:num w:numId="5" w16cid:durableId="32392688">
+  <w:num w:numId="5" w16cid:durableId="1579710668">
     <w:abstractNumId w:val="7"/>
   </w:num>
-  <w:num w:numId="6" w16cid:durableId="139811261">
+  <w:num w:numId="6" w16cid:durableId="468547543">
     <w:abstractNumId w:val="3"/>
   </w:num>
-  <w:num w:numId="7" w16cid:durableId="1188790174">
+  <w:num w:numId="7" w16cid:durableId="991635906">
     <w:abstractNumId w:val="2"/>
   </w:num>
-  <w:num w:numId="8" w16cid:durableId="881599151">
+  <w:num w:numId="8" w16cid:durableId="1593391163">
     <w:abstractNumId w:val="1"/>
   </w:num>
-  <w:num w:numId="9" w16cid:durableId="2122532891">
+  <w:num w:numId="9" w16cid:durableId="53235255">
     <w:abstractNumId w:val="0"/>
   </w:num>
 </w:numbering>

</xml_diff>

<commit_message>
Use full names in author contributions
</commit_message>
<xml_diff>
--- a/report/Low_Group_Delay_Morphology_Preserving_Filtering_Report.docx
+++ b/report/Low_Group_Delay_Morphology_Preserving_Filtering_Report.docx
@@ -5614,7 +5614,7 @@
           <w:noProof/>
         </w:rPr>
         <w:drawing>
-          <wp:inline distT="0" distB="0" distL="0" distR="0" wp14:anchorId="5D3340F1" wp14:editId="124F4614">
+          <wp:inline distT="0" distB="0" distL="0" distR="0" wp14:anchorId="05C563CC" wp14:editId="00923D30">
             <wp:extent cx="5940000" cy="2064172"/>
             <wp:effectExtent l="0" t="0" r="0" b="0"/>
             <wp:docPr id="1" name="Picture 1"/>
@@ -5677,7 +5677,7 @@
           <w:noProof/>
         </w:rPr>
         <w:drawing>
-          <wp:inline distT="0" distB="0" distL="0" distR="0" wp14:anchorId="06402FA8" wp14:editId="6770F0F5">
+          <wp:inline distT="0" distB="0" distL="0" distR="0" wp14:anchorId="05421722" wp14:editId="537E2BC6">
             <wp:extent cx="5940000" cy="1772439"/>
             <wp:effectExtent l="0" t="0" r="0" b="0"/>
             <wp:docPr id="2" name="Picture 2"/>
@@ -5754,7 +5754,7 @@
         </w:rPr>
         <w:lastRenderedPageBreak/>
         <w:drawing>
-          <wp:inline distT="0" distB="0" distL="0" distR="0" wp14:anchorId="72D8D84B" wp14:editId="03EEA7AA">
+          <wp:inline distT="0" distB="0" distL="0" distR="0" wp14:anchorId="2A6227A7" wp14:editId="1297E84B">
             <wp:extent cx="5940000" cy="2005447"/>
             <wp:effectExtent l="0" t="0" r="0" b="0"/>
             <wp:docPr id="3" name="Picture 3"/>
@@ -5817,7 +5817,7 @@
           <w:noProof/>
         </w:rPr>
         <w:drawing>
-          <wp:inline distT="0" distB="0" distL="0" distR="0" wp14:anchorId="75A2E651" wp14:editId="056AAF29">
+          <wp:inline distT="0" distB="0" distL="0" distR="0" wp14:anchorId="68B748AE" wp14:editId="5A6C2755">
             <wp:extent cx="5040000" cy="3354172"/>
             <wp:effectExtent l="0" t="0" r="0" b="0"/>
             <wp:docPr id="4" name="Picture 4"/>
@@ -5881,7 +5881,7 @@
         </w:rPr>
         <w:lastRenderedPageBreak/>
         <w:drawing>
-          <wp:inline distT="0" distB="0" distL="0" distR="0" wp14:anchorId="68CE6393" wp14:editId="50CEFAA2">
+          <wp:inline distT="0" distB="0" distL="0" distR="0" wp14:anchorId="022DC5D8" wp14:editId="310B9A67">
             <wp:extent cx="5940000" cy="2064172"/>
             <wp:effectExtent l="0" t="0" r="0" b="0"/>
             <wp:docPr id="5" name="Picture 5"/>
@@ -6867,7 +6867,7 @@
           <w:noProof/>
         </w:rPr>
         <w:drawing>
-          <wp:inline distT="0" distB="0" distL="0" distR="0" wp14:anchorId="2F71F8D6" wp14:editId="4263F75E">
+          <wp:inline distT="0" distB="0" distL="0" distR="0" wp14:anchorId="252F3E55" wp14:editId="2077165A">
             <wp:extent cx="5940000" cy="1568089"/>
             <wp:effectExtent l="0" t="0" r="0" b="0"/>
             <wp:docPr id="6" name="Picture 6"/>
@@ -6943,7 +6943,7 @@
           <w:noProof/>
         </w:rPr>
         <w:drawing>
-          <wp:inline distT="0" distB="0" distL="0" distR="0" wp14:anchorId="1015B1E2" wp14:editId="2B55F1B0">
+          <wp:inline distT="0" distB="0" distL="0" distR="0" wp14:anchorId="13A13B83" wp14:editId="2B74C8A3">
             <wp:extent cx="5940000" cy="1568089"/>
             <wp:effectExtent l="0" t="0" r="0" b="0"/>
             <wp:docPr id="7" name="Picture 7"/>
@@ -7007,7 +7007,7 @@
           <w:noProof/>
         </w:rPr>
         <w:drawing>
-          <wp:inline distT="0" distB="0" distL="0" distR="0" wp14:anchorId="1B25A476" wp14:editId="0E230D33">
+          <wp:inline distT="0" distB="0" distL="0" distR="0" wp14:anchorId="3A41E9F6" wp14:editId="0DB9468E">
             <wp:extent cx="5940000" cy="2064172"/>
             <wp:effectExtent l="0" t="0" r="0" b="0"/>
             <wp:docPr id="8" name="Picture 8"/>
@@ -7070,7 +7070,7 @@
           <w:noProof/>
         </w:rPr>
         <w:drawing>
-          <wp:inline distT="0" distB="0" distL="0" distR="0" wp14:anchorId="71BE1832" wp14:editId="24B3189F">
+          <wp:inline distT="0" distB="0" distL="0" distR="0" wp14:anchorId="17D4744E" wp14:editId="4C7E8916">
             <wp:extent cx="3960000" cy="2549492"/>
             <wp:effectExtent l="0" t="0" r="0" b="0"/>
             <wp:docPr id="9" name="Picture 9"/>
@@ -9928,7 +9928,7 @@
         </w:rPr>
         <w:lastRenderedPageBreak/>
         <w:drawing>
-          <wp:inline distT="0" distB="0" distL="0" distR="0" wp14:anchorId="05C45951" wp14:editId="58A32BD3">
+          <wp:inline distT="0" distB="0" distL="0" distR="0" wp14:anchorId="2D5DE60A" wp14:editId="064EC755">
             <wp:extent cx="5940000" cy="2122897"/>
             <wp:effectExtent l="0" t="0" r="0" b="0"/>
             <wp:docPr id="10" name="Picture 10"/>
@@ -11772,7 +11772,7 @@
           <w:noProof/>
         </w:rPr>
         <w:drawing>
-          <wp:inline distT="0" distB="0" distL="0" distR="0" wp14:anchorId="06D52EB9" wp14:editId="3B6E265B">
+          <wp:inline distT="0" distB="0" distL="0" distR="0" wp14:anchorId="1741B61D" wp14:editId="4EF42CC8">
             <wp:extent cx="5940000" cy="3292373"/>
             <wp:effectExtent l="0" t="0" r="0" b="0"/>
             <wp:docPr id="11" name="Picture 11"/>
@@ -11835,7 +11835,7 @@
           <w:noProof/>
         </w:rPr>
         <w:drawing>
-          <wp:inline distT="0" distB="0" distL="0" distR="0" wp14:anchorId="0BC23EEA" wp14:editId="35F43FEB">
+          <wp:inline distT="0" distB="0" distL="0" distR="0" wp14:anchorId="0866E1FB" wp14:editId="6DF80E2E">
             <wp:extent cx="5940000" cy="3267935"/>
             <wp:effectExtent l="0" t="0" r="0" b="0"/>
             <wp:docPr id="12" name="Picture 12"/>
@@ -13682,7 +13682,7 @@
           <w:noProof/>
         </w:rPr>
         <w:drawing>
-          <wp:inline distT="0" distB="0" distL="0" distR="0" wp14:anchorId="7644FAF3" wp14:editId="4F5C41A6">
+          <wp:inline distT="0" distB="0" distL="0" distR="0" wp14:anchorId="6044FD29" wp14:editId="51B0F0E0">
             <wp:extent cx="5940000" cy="2005447"/>
             <wp:effectExtent l="0" t="0" r="0" b="0"/>
             <wp:docPr id="13" name="Picture 13"/>
@@ -15704,7 +15704,7 @@
         </w:rPr>
         <w:lastRenderedPageBreak/>
         <w:drawing>
-          <wp:inline distT="0" distB="0" distL="0" distR="0" wp14:anchorId="214F636F" wp14:editId="7DA662E6">
+          <wp:inline distT="0" distB="0" distL="0" distR="0" wp14:anchorId="0C159932" wp14:editId="33A2C225">
             <wp:extent cx="5940000" cy="2005447"/>
             <wp:effectExtent l="0" t="0" r="0" b="0"/>
             <wp:docPr id="14" name="Picture 14"/>
@@ -17152,11 +17152,14 @@
         <w:jc w:val="both"/>
       </w:pPr>
       <w:r>
-        <w:t xml:space="preserve">V.N.S.I. derived the morphology-error model and the group-delay kernel, formulated MO-LDFIR as a second-order-cone program, and carried out its ablations, the latency-budget sweep, the computational-cost analysis and the error-model validation. N.P. defined the signal model, matched specification and metrics, designed the baseline filters, produced the phase, group-delay, pole-zero and transient analyses, and carried out the finite word-length study. M.T. </w:t>
+        <w:t>V N Shahid Ibrahim derived the morphology-error model and the group-delay kernel, formulated MO-LDFIR as a second-order-cone program, and carried out its ablations, the latency-budget sweep, the computational-cost analysis and the error-model validation. Nida Paravath defined the signal model, matched specification and metrics, designed the baseline filters, produced the phase, group-delay, pole-zero and transient analyses, and carried out the finite word-</w:t>
       </w:r>
       <w:r>
         <w:lastRenderedPageBreak/>
-        <w:t>built the data and evaluation pipeline, including the DS1 hyperparameter selection, implemented the synthetic ECG Monte-Carlo experiments, ran the MIT-BIH DS2 and PTB-XL validation with the statistical analysis, and prepared the reproducibility package. D.M. developed EW-APE and the classical equalizer baseline, ran the Pareto sweeps and the PPG case study, and wrote the design recommendations and limitations. All authors contributed to the literature review and to writing and revising the report.</w:t>
+        <w:t>length study. Madhav Tripathi built the data and evaluation pipeline, including the DS1 hyperparameter selection, implemented the synthetic ECG Monte-Carlo experiments, ran the MIT-BIH DS2 and PTB-XL validation with the statistical analysis, and prepared the reproducibility package. Deepak Meena developed EW-APE and the classical equalizer baseline, ran the Pareto sweeps and the PPG case study, and wrote the design recommendations and limitations. All authors contributed to the literature review and to writ</w:t>
+      </w:r>
+      <w:r>
+        <w:t>ing and revising the report.</w:t>
       </w:r>
     </w:p>
     <w:sectPr>
@@ -17342,31 +17345,31 @@
       </w:rPr>
     </w:lvl>
   </w:abstractNum>
-  <w:num w:numId="1" w16cid:durableId="580650492">
+  <w:num w:numId="1" w16cid:durableId="829760817">
     <w:abstractNumId w:val="8"/>
   </w:num>
-  <w:num w:numId="2" w16cid:durableId="1475178387">
+  <w:num w:numId="2" w16cid:durableId="990520611">
     <w:abstractNumId w:val="6"/>
   </w:num>
-  <w:num w:numId="3" w16cid:durableId="1956011201">
+  <w:num w:numId="3" w16cid:durableId="1800030873">
     <w:abstractNumId w:val="5"/>
   </w:num>
-  <w:num w:numId="4" w16cid:durableId="2130203503">
+  <w:num w:numId="4" w16cid:durableId="526601306">
     <w:abstractNumId w:val="4"/>
   </w:num>
-  <w:num w:numId="5" w16cid:durableId="1579710668">
+  <w:num w:numId="5" w16cid:durableId="857163852">
     <w:abstractNumId w:val="7"/>
   </w:num>
-  <w:num w:numId="6" w16cid:durableId="468547543">
+  <w:num w:numId="6" w16cid:durableId="514997457">
     <w:abstractNumId w:val="3"/>
   </w:num>
-  <w:num w:numId="7" w16cid:durableId="991635906">
+  <w:num w:numId="7" w16cid:durableId="254049703">
     <w:abstractNumId w:val="2"/>
   </w:num>
-  <w:num w:numId="8" w16cid:durableId="1593391163">
+  <w:num w:numId="8" w16cid:durableId="921640233">
     <w:abstractNumId w:val="1"/>
   </w:num>
-  <w:num w:numId="9" w16cid:durableId="53235255">
+  <w:num w:numId="9" w16cid:durableId="1583175695">
     <w:abstractNumId w:val="0"/>
   </w:num>
 </w:numbering>

</xml_diff>